<commit_message>
scenario: add the Enrolline baseline topology diagram
Generated from its spec in the content repo via the draw-diagram skill; the
.drawio is the editable source and the .png is rendered from it. Published on
the Enrolline Network Diagram page, which was the only ICT record in the set
carrying tables but no figure, and embedded as Figure 4.4 in the regenerated
Baseline Solution Design.

Also widens that page to s1-cl3-at2 and at3 so it matches its three sibling
Enrolline ICT records — AT3 asks students to document as-deployed against this
baseline, so they need to be able to see it.

Co-Authored-By: Claude Opus 5 (1M context) <noreply@anthropic.com>
</commit_message>
<xml_diff>
--- a/public/documents/YAT-Enrolline-Baseline-Solution-Design.docx
+++ b/public/documents/YAT-Enrolline-Baseline-Solution-Design.docx
@@ -2378,6 +2378,58 @@
     </w:p>
     <w:p>
       <w:pPr>
+        <w:jc w:val="center"/>
+      </w:pPr>
+      <w:r>
+        <w:drawing>
+          <wp:inline xmlns:a="http://schemas.openxmlformats.org/drawingml/2006/main" xmlns:pic="http://schemas.openxmlformats.org/drawingml/2006/picture">
+            <wp:extent cx="5760000" cy="4450909"/>
+            <wp:docPr id="1" name="Picture 1"/>
+            <wp:cNvGraphicFramePr>
+              <a:graphicFrameLocks noChangeAspect="1"/>
+            </wp:cNvGraphicFramePr>
+            <a:graphic>
+              <a:graphicData uri="http://schemas.openxmlformats.org/drawingml/2006/picture">
+                <pic:pic>
+                  <pic:nvPicPr>
+                    <pic:cNvPr id="0" name="network-enrolline-baseline-singleaz.png"/>
+                    <pic:cNvPicPr/>
+                  </pic:nvPicPr>
+                  <pic:blipFill>
+                    <a:blip r:embed="rId15"/>
+                    <a:stretch>
+                      <a:fillRect/>
+                    </a:stretch>
+                  </pic:blipFill>
+                  <pic:spPr>
+                    <a:xfrm>
+                      <a:off x="0" y="0"/>
+                      <a:ext cx="5760000" cy="4450909"/>
+                    </a:xfrm>
+                    <a:prstGeom prst="rect"/>
+                  </pic:spPr>
+                </pic:pic>
+              </a:graphicData>
+            </a:graphic>
+          </wp:inline>
+        </w:drawing>
+      </w:r>
+    </w:p>
+    <w:p>
+      <w:pPr>
+        <w:jc w:val="center"/>
+      </w:pPr>
+      <w:r>
+        <w:rPr>
+          <w:i/>
+          <w:color w:val="6B6660"/>
+          <w:sz w:val="18"/>
+        </w:rPr>
+        <w:t>Figure 4.4 — Enrolline baseline network topology. The workload runs in ap-southeast-2a; the second-zone subnets carry only the load balancer and the database subnet group. Amazon S3 is a regional service and sits outside the VPC, reached through the NAT Gateway.</w:t>
+      </w:r>
+    </w:p>
+    <w:p>
+      <w:pPr>
         <w:pStyle w:val="Heading3"/>
       </w:pPr>
       <w:r>

</xml_diff>